<commit_message>
feat: generate HTML reports and update converter for processing test reports
</commit_message>
<xml_diff>
--- a/extracted_jsons/TestReport_DULAL NAHA (KOL2604070057)_2600128556_11d3f985-7e08-40be-91b4-48b35be363ee.docx
+++ b/extracted_jsons/TestReport_DULAL NAHA (KOL2604070057)_2600128556_11d3f985-7e08-40be-91b4-48b35be363ee.docx
@@ -18,12 +18,12 @@
         <w:jc w:val="center"/>
         <w:tblLook w:firstColumn="1" w:firstRow="1" w:lastColumn="0" w:lastRow="0" w:noHBand="0" w:noVBand="1" w:val="04A0"/>
         <w:tblBorders>
-          <w:top w:val="single" w:sz="2" w:space="0" w:color="cbd5e1"/>
-          <w:left w:val="single" w:sz="2" w:space="0" w:color="cbd5e1"/>
-          <w:bottom w:val="single" w:sz="2" w:space="0" w:color="cbd5e1"/>
-          <w:right w:val="single" w:sz="2" w:space="0" w:color="cbd5e1"/>
-          <w:insideH w:val="single" w:sz="2" w:space="0" w:color="cbd5e1"/>
-          <w:insideV w:val="single" w:sz="2" w:space="0" w:color="cbd5e1"/>
+          <w:top w:val="single" w:sz="2" w:space="0" w:color="000000"/>
+          <w:left w:val="single" w:sz="2" w:space="0" w:color="000000"/>
+          <w:bottom w:val="single" w:sz="2" w:space="0" w:color="000000"/>
+          <w:right w:val="single" w:sz="2" w:space="0" w:color="000000"/>
+          <w:insideH w:val="single" w:sz="2" w:space="0" w:color="000000"/>
+          <w:insideV w:val="single" w:sz="2" w:space="0" w:color="000000"/>
         </w:tblBorders>
       </w:tblPr>
       <w:tblGrid>
@@ -488,12 +488,12 @@
         <w:jc w:val="center"/>
         <w:tblLook w:firstColumn="1" w:firstRow="1" w:lastColumn="0" w:lastRow="0" w:noHBand="0" w:noVBand="1" w:val="04A0"/>
         <w:tblBorders>
-          <w:top w:val="single" w:sz="4" w:space="0" w:color="1f497d"/>
-          <w:left w:val="single" w:sz="4" w:space="0" w:color="1f497d"/>
-          <w:bottom w:val="single" w:sz="4" w:space="0" w:color="1f497d"/>
-          <w:right w:val="single" w:sz="4" w:space="0" w:color="1f497d"/>
-          <w:insideH w:val="single" w:sz="4" w:space="0" w:color="1f497d"/>
-          <w:insideV w:val="single" w:sz="4" w:space="0" w:color="1f497d"/>
+          <w:top w:val="single" w:sz="4" w:space="0" w:color="000000"/>
+          <w:left w:val="single" w:sz="4" w:space="0" w:color="000000"/>
+          <w:bottom w:val="single" w:sz="4" w:space="0" w:color="000000"/>
+          <w:right w:val="single" w:sz="4" w:space="0" w:color="000000"/>
+          <w:insideH w:val="single" w:sz="4" w:space="0" w:color="000000"/>
+          <w:insideV w:val="single" w:sz="4" w:space="0" w:color="000000"/>
         </w:tblBorders>
       </w:tblPr>
       <w:tblGrid>
@@ -842,12 +842,12 @@
         <w:jc w:val="center"/>
         <w:tblLook w:firstColumn="1" w:firstRow="1" w:lastColumn="0" w:lastRow="0" w:noHBand="0" w:noVBand="1" w:val="04A0"/>
         <w:tblBorders>
-          <w:top w:val="single" w:sz="4" w:space="0" w:color="1f497d"/>
-          <w:left w:val="single" w:sz="4" w:space="0" w:color="1f497d"/>
-          <w:bottom w:val="single" w:sz="4" w:space="0" w:color="1f497d"/>
-          <w:right w:val="single" w:sz="4" w:space="0" w:color="1f497d"/>
-          <w:insideH w:val="single" w:sz="4" w:space="0" w:color="1f497d"/>
-          <w:insideV w:val="single" w:sz="4" w:space="0" w:color="1f497d"/>
+          <w:top w:val="single" w:sz="4" w:space="0" w:color="000000"/>
+          <w:left w:val="single" w:sz="4" w:space="0" w:color="000000"/>
+          <w:bottom w:val="single" w:sz="4" w:space="0" w:color="000000"/>
+          <w:right w:val="single" w:sz="4" w:space="0" w:color="000000"/>
+          <w:insideH w:val="single" w:sz="4" w:space="0" w:color="000000"/>
+          <w:insideV w:val="single" w:sz="4" w:space="0" w:color="000000"/>
         </w:tblBorders>
       </w:tblPr>
       <w:tblGrid>
@@ -1169,12 +1169,12 @@
         <w:jc w:val="center"/>
         <w:tblLook w:firstColumn="1" w:firstRow="1" w:lastColumn="0" w:lastRow="0" w:noHBand="0" w:noVBand="1" w:val="04A0"/>
         <w:tblBorders>
-          <w:top w:val="single" w:sz="4" w:space="0" w:color="1f497d"/>
-          <w:left w:val="single" w:sz="4" w:space="0" w:color="1f497d"/>
-          <w:bottom w:val="single" w:sz="4" w:space="0" w:color="1f497d"/>
-          <w:right w:val="single" w:sz="4" w:space="0" w:color="1f497d"/>
-          <w:insideH w:val="single" w:sz="4" w:space="0" w:color="1f497d"/>
-          <w:insideV w:val="single" w:sz="4" w:space="0" w:color="1f497d"/>
+          <w:top w:val="single" w:sz="4" w:space="0" w:color="000000"/>
+          <w:left w:val="single" w:sz="4" w:space="0" w:color="000000"/>
+          <w:bottom w:val="single" w:sz="4" w:space="0" w:color="000000"/>
+          <w:right w:val="single" w:sz="4" w:space="0" w:color="000000"/>
+          <w:insideH w:val="single" w:sz="4" w:space="0" w:color="000000"/>
+          <w:insideV w:val="single" w:sz="4" w:space="0" w:color="000000"/>
         </w:tblBorders>
       </w:tblPr>
       <w:tblGrid>
@@ -1530,12 +1530,12 @@
         <w:jc w:val="center"/>
         <w:tblLook w:firstColumn="1" w:firstRow="1" w:lastColumn="0" w:lastRow="0" w:noHBand="0" w:noVBand="1" w:val="04A0"/>
         <w:tblBorders>
-          <w:top w:val="single" w:sz="4" w:space="0" w:color="1f497d"/>
-          <w:left w:val="single" w:sz="4" w:space="0" w:color="1f497d"/>
-          <w:bottom w:val="single" w:sz="4" w:space="0" w:color="1f497d"/>
-          <w:right w:val="single" w:sz="4" w:space="0" w:color="1f497d"/>
-          <w:insideH w:val="single" w:sz="4" w:space="0" w:color="1f497d"/>
-          <w:insideV w:val="single" w:sz="4" w:space="0" w:color="1f497d"/>
+          <w:top w:val="single" w:sz="4" w:space="0" w:color="000000"/>
+          <w:left w:val="single" w:sz="4" w:space="0" w:color="000000"/>
+          <w:bottom w:val="single" w:sz="4" w:space="0" w:color="000000"/>
+          <w:right w:val="single" w:sz="4" w:space="0" w:color="000000"/>
+          <w:insideH w:val="single" w:sz="4" w:space="0" w:color="000000"/>
+          <w:insideV w:val="single" w:sz="4" w:space="0" w:color="000000"/>
         </w:tblBorders>
       </w:tblPr>
       <w:tblGrid>
@@ -1863,12 +1863,12 @@
         <w:jc w:val="center"/>
         <w:tblLook w:firstColumn="1" w:firstRow="1" w:lastColumn="0" w:lastRow="0" w:noHBand="0" w:noVBand="1" w:val="04A0"/>
         <w:tblBorders>
-          <w:top w:val="single" w:sz="4" w:space="0" w:color="1f497d"/>
-          <w:left w:val="single" w:sz="4" w:space="0" w:color="1f497d"/>
-          <w:bottom w:val="single" w:sz="4" w:space="0" w:color="1f497d"/>
-          <w:right w:val="single" w:sz="4" w:space="0" w:color="1f497d"/>
-          <w:insideH w:val="single" w:sz="4" w:space="0" w:color="1f497d"/>
-          <w:insideV w:val="single" w:sz="4" w:space="0" w:color="1f497d"/>
+          <w:top w:val="single" w:sz="4" w:space="0" w:color="000000"/>
+          <w:left w:val="single" w:sz="4" w:space="0" w:color="000000"/>
+          <w:bottom w:val="single" w:sz="4" w:space="0" w:color="000000"/>
+          <w:right w:val="single" w:sz="4" w:space="0" w:color="000000"/>
+          <w:insideH w:val="single" w:sz="4" w:space="0" w:color="000000"/>
+          <w:insideV w:val="single" w:sz="4" w:space="0" w:color="000000"/>
         </w:tblBorders>
       </w:tblPr>
       <w:tblGrid>
@@ -2074,12 +2074,12 @@
         <w:jc w:val="center"/>
         <w:tblLook w:firstColumn="1" w:firstRow="1" w:lastColumn="0" w:lastRow="0" w:noHBand="0" w:noVBand="1" w:val="04A0"/>
         <w:tblBorders>
-          <w:top w:val="single" w:sz="4" w:space="0" w:color="1f497d"/>
-          <w:left w:val="single" w:sz="4" w:space="0" w:color="1f497d"/>
-          <w:bottom w:val="single" w:sz="4" w:space="0" w:color="1f497d"/>
-          <w:right w:val="single" w:sz="4" w:space="0" w:color="1f497d"/>
-          <w:insideH w:val="single" w:sz="4" w:space="0" w:color="1f497d"/>
-          <w:insideV w:val="single" w:sz="4" w:space="0" w:color="1f497d"/>
+          <w:top w:val="single" w:sz="4" w:space="0" w:color="000000"/>
+          <w:left w:val="single" w:sz="4" w:space="0" w:color="000000"/>
+          <w:bottom w:val="single" w:sz="4" w:space="0" w:color="000000"/>
+          <w:right w:val="single" w:sz="4" w:space="0" w:color="000000"/>
+          <w:insideH w:val="single" w:sz="4" w:space="0" w:color="000000"/>
+          <w:insideV w:val="single" w:sz="4" w:space="0" w:color="000000"/>
         </w:tblBorders>
       </w:tblPr>
       <w:tblGrid>
@@ -2397,12 +2397,12 @@
         <w:jc w:val="center"/>
         <w:tblLook w:firstColumn="1" w:firstRow="1" w:lastColumn="0" w:lastRow="0" w:noHBand="0" w:noVBand="1" w:val="04A0"/>
         <w:tblBorders>
-          <w:top w:val="single" w:sz="4" w:space="0" w:color="1f497d"/>
-          <w:left w:val="single" w:sz="4" w:space="0" w:color="1f497d"/>
-          <w:bottom w:val="single" w:sz="4" w:space="0" w:color="1f497d"/>
-          <w:right w:val="single" w:sz="4" w:space="0" w:color="1f497d"/>
-          <w:insideH w:val="single" w:sz="4" w:space="0" w:color="1f497d"/>
-          <w:insideV w:val="single" w:sz="4" w:space="0" w:color="1f497d"/>
+          <w:top w:val="single" w:sz="4" w:space="0" w:color="000000"/>
+          <w:left w:val="single" w:sz="4" w:space="0" w:color="000000"/>
+          <w:bottom w:val="single" w:sz="4" w:space="0" w:color="000000"/>
+          <w:right w:val="single" w:sz="4" w:space="0" w:color="000000"/>
+          <w:insideH w:val="single" w:sz="4" w:space="0" w:color="000000"/>
+          <w:insideV w:val="single" w:sz="4" w:space="0" w:color="000000"/>
         </w:tblBorders>
       </w:tblPr>
       <w:tblGrid>
@@ -2611,12 +2611,12 @@
         <w:jc w:val="center"/>
         <w:tblLook w:firstColumn="1" w:firstRow="1" w:lastColumn="0" w:lastRow="0" w:noHBand="0" w:noVBand="1" w:val="04A0"/>
         <w:tblBorders>
-          <w:top w:val="single" w:sz="4" w:space="0" w:color="1f497d"/>
-          <w:left w:val="single" w:sz="4" w:space="0" w:color="1f497d"/>
-          <w:bottom w:val="single" w:sz="4" w:space="0" w:color="1f497d"/>
-          <w:right w:val="single" w:sz="4" w:space="0" w:color="1f497d"/>
-          <w:insideH w:val="single" w:sz="4" w:space="0" w:color="1f497d"/>
-          <w:insideV w:val="single" w:sz="4" w:space="0" w:color="1f497d"/>
+          <w:top w:val="single" w:sz="4" w:space="0" w:color="000000"/>
+          <w:left w:val="single" w:sz="4" w:space="0" w:color="000000"/>
+          <w:bottom w:val="single" w:sz="4" w:space="0" w:color="000000"/>
+          <w:right w:val="single" w:sz="4" w:space="0" w:color="000000"/>
+          <w:insideH w:val="single" w:sz="4" w:space="0" w:color="000000"/>
+          <w:insideV w:val="single" w:sz="4" w:space="0" w:color="000000"/>
         </w:tblBorders>
       </w:tblPr>
       <w:tblGrid>
@@ -4024,12 +4024,12 @@
         <w:jc w:val="center"/>
         <w:tblLook w:firstColumn="1" w:firstRow="1" w:lastColumn="0" w:lastRow="0" w:noHBand="0" w:noVBand="1" w:val="04A0"/>
         <w:tblBorders>
-          <w:top w:val="single" w:sz="4" w:space="0" w:color="1f497d"/>
-          <w:left w:val="single" w:sz="4" w:space="0" w:color="1f497d"/>
-          <w:bottom w:val="single" w:sz="4" w:space="0" w:color="1f497d"/>
-          <w:right w:val="single" w:sz="4" w:space="0" w:color="1f497d"/>
-          <w:insideH w:val="single" w:sz="4" w:space="0" w:color="1f497d"/>
-          <w:insideV w:val="single" w:sz="4" w:space="0" w:color="1f497d"/>
+          <w:top w:val="single" w:sz="4" w:space="0" w:color="000000"/>
+          <w:left w:val="single" w:sz="4" w:space="0" w:color="000000"/>
+          <w:bottom w:val="single" w:sz="4" w:space="0" w:color="000000"/>
+          <w:right w:val="single" w:sz="4" w:space="0" w:color="000000"/>
+          <w:insideH w:val="single" w:sz="4" w:space="0" w:color="000000"/>
+          <w:insideV w:val="single" w:sz="4" w:space="0" w:color="000000"/>
         </w:tblBorders>
       </w:tblPr>
       <w:tblGrid>
@@ -7174,12 +7174,12 @@
         <w:jc w:val="center"/>
         <w:tblLook w:firstColumn="1" w:firstRow="1" w:lastColumn="0" w:lastRow="0" w:noHBand="0" w:noVBand="1" w:val="04A0"/>
         <w:tblBorders>
-          <w:top w:val="single" w:sz="4" w:space="0" w:color="1f497d"/>
-          <w:left w:val="single" w:sz="4" w:space="0" w:color="1f497d"/>
-          <w:bottom w:val="single" w:sz="4" w:space="0" w:color="1f497d"/>
-          <w:right w:val="single" w:sz="4" w:space="0" w:color="1f497d"/>
-          <w:insideH w:val="single" w:sz="4" w:space="0" w:color="1f497d"/>
-          <w:insideV w:val="single" w:sz="4" w:space="0" w:color="1f497d"/>
+          <w:top w:val="single" w:sz="4" w:space="0" w:color="000000"/>
+          <w:left w:val="single" w:sz="4" w:space="0" w:color="000000"/>
+          <w:bottom w:val="single" w:sz="4" w:space="0" w:color="000000"/>
+          <w:right w:val="single" w:sz="4" w:space="0" w:color="000000"/>
+          <w:insideH w:val="single" w:sz="4" w:space="0" w:color="000000"/>
+          <w:insideV w:val="single" w:sz="4" w:space="0" w:color="000000"/>
         </w:tblBorders>
       </w:tblPr>
       <w:tblGrid>
@@ -8709,12 +8709,12 @@
         <w:jc w:val="center"/>
         <w:tblLook w:firstColumn="1" w:firstRow="1" w:lastColumn="0" w:lastRow="0" w:noHBand="0" w:noVBand="1" w:val="04A0"/>
         <w:tblBorders>
-          <w:top w:val="single" w:sz="2" w:space="0" w:color="cbd5e1"/>
-          <w:left w:val="single" w:sz="2" w:space="0" w:color="cbd5e1"/>
-          <w:bottom w:val="single" w:sz="2" w:space="0" w:color="cbd5e1"/>
-          <w:right w:val="single" w:sz="2" w:space="0" w:color="cbd5e1"/>
-          <w:insideH w:val="single" w:sz="2" w:space="0" w:color="cbd5e1"/>
-          <w:insideV w:val="single" w:sz="2" w:space="0" w:color="cbd5e1"/>
+          <w:top w:val="single" w:sz="2" w:space="0" w:color="000000"/>
+          <w:left w:val="single" w:sz="2" w:space="0" w:color="000000"/>
+          <w:bottom w:val="single" w:sz="2" w:space="0" w:color="000000"/>
+          <w:right w:val="single" w:sz="2" w:space="0" w:color="000000"/>
+          <w:insideH w:val="single" w:sz="2" w:space="0" w:color="000000"/>
+          <w:insideV w:val="single" w:sz="2" w:space="0" w:color="000000"/>
         </w:tblBorders>
       </w:tblPr>
       <w:tblGrid>
@@ -9027,12 +9027,12 @@
         <w:jc w:val="center"/>
         <w:tblLook w:firstColumn="1" w:firstRow="1" w:lastColumn="0" w:lastRow="0" w:noHBand="0" w:noVBand="1" w:val="04A0"/>
         <w:tblBorders>
-          <w:top w:val="single" w:sz="2" w:space="0" w:color="cbd5e1"/>
-          <w:left w:val="single" w:sz="2" w:space="0" w:color="cbd5e1"/>
-          <w:bottom w:val="single" w:sz="2" w:space="0" w:color="cbd5e1"/>
-          <w:right w:val="single" w:sz="2" w:space="0" w:color="cbd5e1"/>
-          <w:insideH w:val="single" w:sz="2" w:space="0" w:color="cbd5e1"/>
-          <w:insideV w:val="single" w:sz="2" w:space="0" w:color="cbd5e1"/>
+          <w:top w:val="single" w:sz="2" w:space="0" w:color="000000"/>
+          <w:left w:val="single" w:sz="2" w:space="0" w:color="000000"/>
+          <w:bottom w:val="single" w:sz="2" w:space="0" w:color="000000"/>
+          <w:right w:val="single" w:sz="2" w:space="0" w:color="000000"/>
+          <w:insideH w:val="single" w:sz="2" w:space="0" w:color="000000"/>
+          <w:insideV w:val="single" w:sz="2" w:space="0" w:color="000000"/>
         </w:tblBorders>
       </w:tblPr>
       <w:tblGrid>
@@ -9476,12 +9476,12 @@
         <w:jc w:val="center"/>
         <w:tblLook w:firstColumn="1" w:firstRow="1" w:lastColumn="0" w:lastRow="0" w:noHBand="0" w:noVBand="1" w:val="04A0"/>
         <w:tblBorders>
-          <w:top w:val="single" w:sz="4" w:space="0" w:color="1f497d"/>
-          <w:left w:val="single" w:sz="4" w:space="0" w:color="1f497d"/>
-          <w:bottom w:val="single" w:sz="4" w:space="0" w:color="1f497d"/>
-          <w:right w:val="single" w:sz="4" w:space="0" w:color="1f497d"/>
-          <w:insideH w:val="single" w:sz="4" w:space="0" w:color="1f497d"/>
-          <w:insideV w:val="single" w:sz="4" w:space="0" w:color="1f497d"/>
+          <w:top w:val="single" w:sz="4" w:space="0" w:color="000000"/>
+          <w:left w:val="single" w:sz="4" w:space="0" w:color="000000"/>
+          <w:bottom w:val="single" w:sz="4" w:space="0" w:color="000000"/>
+          <w:right w:val="single" w:sz="4" w:space="0" w:color="000000"/>
+          <w:insideH w:val="single" w:sz="4" w:space="0" w:color="000000"/>
+          <w:insideV w:val="single" w:sz="4" w:space="0" w:color="000000"/>
         </w:tblBorders>
       </w:tblPr>
       <w:tblGrid>
@@ -10327,12 +10327,12 @@
         <w:jc w:val="center"/>
         <w:tblLook w:firstColumn="1" w:firstRow="1" w:lastColumn="0" w:lastRow="0" w:noHBand="0" w:noVBand="1" w:val="04A0"/>
         <w:tblBorders>
-          <w:top w:val="single" w:sz="4" w:space="0" w:color="1f497d"/>
-          <w:left w:val="single" w:sz="4" w:space="0" w:color="1f497d"/>
-          <w:bottom w:val="single" w:sz="4" w:space="0" w:color="1f497d"/>
-          <w:right w:val="single" w:sz="4" w:space="0" w:color="1f497d"/>
-          <w:insideH w:val="single" w:sz="4" w:space="0" w:color="1f497d"/>
-          <w:insideV w:val="single" w:sz="4" w:space="0" w:color="1f497d"/>
+          <w:top w:val="single" w:sz="4" w:space="0" w:color="000000"/>
+          <w:left w:val="single" w:sz="4" w:space="0" w:color="000000"/>
+          <w:bottom w:val="single" w:sz="4" w:space="0" w:color="000000"/>
+          <w:right w:val="single" w:sz="4" w:space="0" w:color="000000"/>
+          <w:insideH w:val="single" w:sz="4" w:space="0" w:color="000000"/>
+          <w:insideV w:val="single" w:sz="4" w:space="0" w:color="000000"/>
         </w:tblBorders>
       </w:tblPr>
       <w:tblGrid>
@@ -10726,12 +10726,12 @@
         <w:jc w:val="center"/>
         <w:tblLook w:firstColumn="1" w:firstRow="1" w:lastColumn="0" w:lastRow="0" w:noHBand="0" w:noVBand="1" w:val="04A0"/>
         <w:tblBorders>
-          <w:top w:val="single" w:sz="4" w:space="0" w:color="1f497d"/>
-          <w:left w:val="single" w:sz="4" w:space="0" w:color="1f497d"/>
-          <w:bottom w:val="single" w:sz="4" w:space="0" w:color="1f497d"/>
-          <w:right w:val="single" w:sz="4" w:space="0" w:color="1f497d"/>
-          <w:insideH w:val="single" w:sz="4" w:space="0" w:color="1f497d"/>
-          <w:insideV w:val="single" w:sz="4" w:space="0" w:color="1f497d"/>
+          <w:top w:val="single" w:sz="4" w:space="0" w:color="000000"/>
+          <w:left w:val="single" w:sz="4" w:space="0" w:color="000000"/>
+          <w:bottom w:val="single" w:sz="4" w:space="0" w:color="000000"/>
+          <w:right w:val="single" w:sz="4" w:space="0" w:color="000000"/>
+          <w:insideH w:val="single" w:sz="4" w:space="0" w:color="000000"/>
+          <w:insideV w:val="single" w:sz="4" w:space="0" w:color="000000"/>
         </w:tblBorders>
       </w:tblPr>
       <w:tblGrid>
@@ -10968,12 +10968,12 @@
         <w:jc w:val="center"/>
         <w:tblLook w:firstColumn="1" w:firstRow="1" w:lastColumn="0" w:lastRow="0" w:noHBand="0" w:noVBand="1" w:val="04A0"/>
         <w:tblBorders>
-          <w:top w:val="single" w:sz="4" w:space="0" w:color="1f497d"/>
-          <w:left w:val="single" w:sz="4" w:space="0" w:color="1f497d"/>
-          <w:bottom w:val="single" w:sz="4" w:space="0" w:color="1f497d"/>
-          <w:right w:val="single" w:sz="4" w:space="0" w:color="1f497d"/>
-          <w:insideH w:val="single" w:sz="4" w:space="0" w:color="1f497d"/>
-          <w:insideV w:val="single" w:sz="4" w:space="0" w:color="1f497d"/>
+          <w:top w:val="single" w:sz="4" w:space="0" w:color="000000"/>
+          <w:left w:val="single" w:sz="4" w:space="0" w:color="000000"/>
+          <w:bottom w:val="single" w:sz="4" w:space="0" w:color="000000"/>
+          <w:right w:val="single" w:sz="4" w:space="0" w:color="000000"/>
+          <w:insideH w:val="single" w:sz="4" w:space="0" w:color="000000"/>
+          <w:insideV w:val="single" w:sz="4" w:space="0" w:color="000000"/>
         </w:tblBorders>
       </w:tblPr>
       <w:tblGrid>
@@ -11299,12 +11299,12 @@
         <w:jc w:val="center"/>
         <w:tblLook w:firstColumn="1" w:firstRow="1" w:lastColumn="0" w:lastRow="0" w:noHBand="0" w:noVBand="1" w:val="04A0"/>
         <w:tblBorders>
-          <w:top w:val="single" w:sz="4" w:space="0" w:color="1f497d"/>
-          <w:left w:val="single" w:sz="4" w:space="0" w:color="1f497d"/>
-          <w:bottom w:val="single" w:sz="4" w:space="0" w:color="1f497d"/>
-          <w:right w:val="single" w:sz="4" w:space="0" w:color="1f497d"/>
-          <w:insideH w:val="single" w:sz="4" w:space="0" w:color="1f497d"/>
-          <w:insideV w:val="single" w:sz="4" w:space="0" w:color="1f497d"/>
+          <w:top w:val="single" w:sz="4" w:space="0" w:color="000000"/>
+          <w:left w:val="single" w:sz="4" w:space="0" w:color="000000"/>
+          <w:bottom w:val="single" w:sz="4" w:space="0" w:color="000000"/>
+          <w:right w:val="single" w:sz="4" w:space="0" w:color="000000"/>
+          <w:insideH w:val="single" w:sz="4" w:space="0" w:color="000000"/>
+          <w:insideV w:val="single" w:sz="4" w:space="0" w:color="000000"/>
         </w:tblBorders>
       </w:tblPr>
       <w:tblGrid>

</xml_diff>